<commit_message>
Harden CGM workbook formulas, refresh stale caches, add significance block
A - Refresh stale em-dash cached results: Summary!B16 (HBS), Comparative
    HBS/SD/CV/min-max deltas, and the J-Index row (B69/C69/D69) so the file
    reads correctly in non-Excel viewers.
B - Rewrite conditional SD/HBS to IF-free SUMPRODUCT form (the IF-in-SUMPRODUCT
    pattern was the source of the stale errors); confirm no _xludf tokens remain.
C - Add Welch/normal-approx significance block (Comparative rows 78-90):
    mean diff -5.45 mg/dL, 95% CI [-6.99,-3.91], p~4e-12, with autocorrelation
    caveat and sample-SD basis.
Docs: README and Standard_Deviation_Analysis.docx updated.
</commit_message>
<xml_diff>
--- a/Standard_Deviation_Analysis.docx
+++ b/Standard_Deviation_Analysis.docx
@@ -353,6 +353,272 @@
         <w:t>Generated for the LingoCGM-Aspargo repository. Glucose data is simulated for demonstration.</w:t>
       </w:r>
     </w:p>
+    <w:p>
+      <w:r>
+        <w:br w:type="page"/>
+      </w:r>
+    </w:p>
+    <w:p>
+      <w:pPr>
+        <w:pStyle w:val="Heading1"/>
+      </w:pPr>
+      <w:r>
+        <w:t>Follow-up Improvements (Robustness + Statistics)</w:t>
+      </w:r>
+    </w:p>
+    <w:p>
+      <w:r>
+        <w:t>After the initial standard-deviation fix, a second round of surgical XML edits was applied to LingoCGM_CGM_Report_codex.xlsx (Summary and Comparative sheets), again preserving all charts and formatting.</w:t>
+      </w:r>
+    </w:p>
+    <w:p>
+      <w:pPr>
+        <w:pStyle w:val="Heading2"/>
+      </w:pPr>
+      <w:r>
+        <w:t>A. Refreshed stale "-" caches</w:t>
+      </w:r>
+    </w:p>
+    <w:p>
+      <w:r>
+        <w:t>Several formula cells had been saved with a stale error value ("-") even though their formulas were valid; they only recovered when reopened in desktop Excel. The correct cached values were re-populated so the workbook reads correctly in any viewer: Summary!B16 (Hyperglycemia Burden Score), the Comparative HBS / SD / CV / min-max delta cells (B16, C16, D13, D14, D16, D20, D21), and the J-Index row (B69/C69/D69), which was blank only because it depends on the SD cells. A few per-day AUC cells (Summary!B49, Comparative!B42/B43) were left to Excel forceFullCalc recalculation on open.</w:t>
+      </w:r>
+    </w:p>
+    <w:p>
+      <w:pPr>
+        <w:pStyle w:val="Heading2"/>
+      </w:pPr>
+      <w:r>
+        <w:t>B. Hardened the formulas</w:t>
+      </w:r>
+    </w:p>
+    <w:p>
+      <w:pPr>
+        <w:pStyle w:val="ListBullet"/>
+      </w:pPr>
+      <w:r>
+        <w:t>Rewrote the conditional standard-deviation and HBS formulas (B16/C16, B20/C20) to an IF-free SUMPRODUCT form. The original SUMPRODUCT(...*IF(ISNUMBER(x),...)...) pattern is what the generating tool kept mis-evaluating into "-"; the IF-free form evaluates cleanly in Excel and in LibreOffice/openpyxl. Verified safe: column B of _Calc has zero text cells.</w:t>
+      </w:r>
+    </w:p>
+    <w:p>
+      <w:pPr>
+        <w:pStyle w:val="ListBullet"/>
+      </w:pPr>
+      <w:r>
+        <w:t>Confirmed no _xludf. function tokens remain anywhere in the workbook.</w:t>
+      </w:r>
+    </w:p>
+    <w:p>
+      <w:pPr>
+        <w:pStyle w:val="Heading2"/>
+      </w:pPr>
+      <w:r>
+        <w:t>C. Statistical significance of the treatment effect</w:t>
+      </w:r>
+    </w:p>
+    <w:p>
+      <w:r>
+        <w:t>A new block (Comparative rows 78-90) tests the mean-glucose difference between the On Meds and Off Meds periods using a Welch two-sample comparison (normal approximation; Welch df is in the thousands, so t ~= z).</w:t>
+      </w:r>
+    </w:p>
+    <w:tbl>
+      <w:tblPr>
+        <w:tblStyle w:val="LightGrid-Accent1"/>
+        <w:tblW w:type="auto" w:w="0"/>
+        <w:tblLook w:firstColumn="1" w:firstRow="1" w:lastColumn="0" w:lastRow="0" w:noHBand="0" w:noVBand="1" w:val="04A0"/>
+      </w:tblPr>
+      <w:tblGrid>
+        <w:gridCol w:w="4320"/>
+        <w:gridCol w:w="4320"/>
+      </w:tblGrid>
+      <w:tr>
+        <w:tc>
+          <w:tcPr>
+            <w:tcW w:type="dxa" w:w="4320"/>
+          </w:tcPr>
+          <w:p>
+            <w:r>
+              <w:t>Quantity</w:t>
+            </w:r>
+          </w:p>
+        </w:tc>
+        <w:tc>
+          <w:tcPr>
+            <w:tcW w:type="dxa" w:w="4320"/>
+          </w:tcPr>
+          <w:p>
+            <w:r>
+              <w:t>Value</w:t>
+            </w:r>
+          </w:p>
+        </w:tc>
+      </w:tr>
+      <w:tr>
+        <w:tc>
+          <w:tcPr>
+            <w:tcW w:type="dxa" w:w="4320"/>
+          </w:tcPr>
+          <w:p>
+            <w:r>
+              <w:t>Off Meds n / On Meds n</w:t>
+            </w:r>
+          </w:p>
+        </w:tc>
+        <w:tc>
+          <w:tcPr>
+            <w:tcW w:type="dxa" w:w="4320"/>
+          </w:tcPr>
+          <w:p>
+            <w:r>
+              <w:t>765 / 2162 readings</w:t>
+            </w:r>
+          </w:p>
+        </w:tc>
+      </w:tr>
+      <w:tr>
+        <w:tc>
+          <w:tcPr>
+            <w:tcW w:type="dxa" w:w="4320"/>
+          </w:tcPr>
+          <w:p>
+            <w:r>
+              <w:t>Off / On sample SD (STDEV.S)</w:t>
+            </w:r>
+          </w:p>
+        </w:tc>
+        <w:tc>
+          <w:tcPr>
+            <w:tcW w:type="dxa" w:w="4320"/>
+          </w:tcPr>
+          <w:p>
+            <w:r>
+              <w:t>17.83 / 20.96 mg/dL</w:t>
+            </w:r>
+          </w:p>
+        </w:tc>
+      </w:tr>
+      <w:tr>
+        <w:tc>
+          <w:tcPr>
+            <w:tcW w:type="dxa" w:w="4320"/>
+          </w:tcPr>
+          <w:p>
+            <w:r>
+              <w:t>Mean difference (On - Off)</w:t>
+            </w:r>
+          </w:p>
+        </w:tc>
+        <w:tc>
+          <w:tcPr>
+            <w:tcW w:type="dxa" w:w="4320"/>
+          </w:tcPr>
+          <w:p>
+            <w:r>
+              <w:t>-5.45 mg/dL</w:t>
+            </w:r>
+          </w:p>
+        </w:tc>
+      </w:tr>
+      <w:tr>
+        <w:tc>
+          <w:tcPr>
+            <w:tcW w:type="dxa" w:w="4320"/>
+          </w:tcPr>
+          <w:p>
+            <w:r>
+              <w:t>Standard error of difference</w:t>
+            </w:r>
+          </w:p>
+        </w:tc>
+        <w:tc>
+          <w:tcPr>
+            <w:tcW w:type="dxa" w:w="4320"/>
+          </w:tcPr>
+          <w:p>
+            <w:r>
+              <w:t>0.79 mg/dL</w:t>
+            </w:r>
+          </w:p>
+        </w:tc>
+      </w:tr>
+      <w:tr>
+        <w:tc>
+          <w:tcPr>
+            <w:tcW w:type="dxa" w:w="4320"/>
+          </w:tcPr>
+          <w:p>
+            <w:r>
+              <w:t>z statistic</w:t>
+            </w:r>
+          </w:p>
+        </w:tc>
+        <w:tc>
+          <w:tcPr>
+            <w:tcW w:type="dxa" w:w="4320"/>
+          </w:tcPr>
+          <w:p>
+            <w:r>
+              <w:t>-6.93</w:t>
+            </w:r>
+          </w:p>
+        </w:tc>
+      </w:tr>
+      <w:tr>
+        <w:tc>
+          <w:tcPr>
+            <w:tcW w:type="dxa" w:w="4320"/>
+          </w:tcPr>
+          <w:p>
+            <w:r>
+              <w:t>p-value (two-sided, normal approx.)</w:t>
+            </w:r>
+          </w:p>
+        </w:tc>
+        <w:tc>
+          <w:tcPr>
+            <w:tcW w:type="dxa" w:w="4320"/>
+          </w:tcPr>
+          <w:p>
+            <w:r>
+              <w:t>~4e-12</w:t>
+            </w:r>
+          </w:p>
+        </w:tc>
+      </w:tr>
+      <w:tr>
+        <w:tc>
+          <w:tcPr>
+            <w:tcW w:type="dxa" w:w="4320"/>
+          </w:tcPr>
+          <w:p>
+            <w:r>
+              <w:t>95% confidence interval</w:t>
+            </w:r>
+          </w:p>
+        </w:tc>
+        <w:tc>
+          <w:tcPr>
+            <w:tcW w:type="dxa" w:w="4320"/>
+          </w:tcPr>
+          <w:p>
+            <w:r>
+              <w:t>[-6.99, -3.91] mg/dL</w:t>
+            </w:r>
+          </w:p>
+        </w:tc>
+      </w:tr>
+    </w:tbl>
+    <w:p>
+      <w:r>
+        <w:rPr>
+          <w:b/>
+        </w:rPr>
+        <w:t xml:space="preserve">Caveat (also embedded in the workbook): </w:t>
+      </w:r>
+      <w:r>
+        <w:t>CGM readings taken minutes apart are autocorrelated, so the effective sample size is far smaller than n and this p-value OVERSTATES significance. Treat the result as exploratory; for formal inference, aggregate to daily means first. The comparison uses sample SD (STDEV.S) rather than population SD, the more defensible choice for a two-group test.</w:t>
+      </w:r>
+    </w:p>
     <w:sectPr>
       <w:pgSz w:w="12240" w:h="15840"/>
       <w:pgMar w:top="1440" w:right="1800" w:bottom="1440" w:left="1800" w:header="720" w:footer="720" w:gutter="0"/>

</xml_diff>